<commit_message>
fix(marco1): complete audit tables, add views/sequences/backup, create md version
</commit_message>
<xml_diff>
--- a/entrega_marco1/relatorio_marco1.docx
+++ b/entrega_marco1/relatorio_marco1.docx
@@ -1422,13 +1422,7 @@
     </w:p>
     <w:p>
       <w:r>
-        <w:rPr>
-          <w:rFonts w:ascii="Times New Roman" w:hAnsi="Times New Roman"/>
-          <w:b w:val="0"/>
-          <w:i w:val="0"/>
-          <w:sz w:val="24"/>
-        </w:rPr>
-        <w:t>A nomenclatura segue a Metodologia de Administração de Dados (MAD/IBAMA): prefixos TB_, RL_, TA_; colunas ID_, DS_, DT_, VL_, ST_, TP_, CD_. Nomes em maiúsculas, sem acentos, no singular, separados por underscore, máximo 30 caracteres.</w:t>
+        <w:t>A nomenclatura segue a Metodologia de Administração de Dados (MAD/IBAMA): prefixos TB_, RL_, TA_, TL_; colunas ID_, DS_, DT_, VL_, ST_, TP_, CD_, DH_; nomes em maiúsculas, sem acentos, no singular, separados por underscore, máximo 30 caracteres. Constraints seguem os prefixos PK_, FK_, UK_, CK_, DF_, IDX_. Funções usam FC_, triggers usam TG_, views usam VW_, e sequences usam SQ_.</w:t>
       </w:r>
     </w:p>
     <w:p>
@@ -1499,6 +1493,44 @@
         <w:t xml:space="preserve">        REFERENCES TB_PROJETO_EXTENSAO(ID_PROJETO)</w:t>
         <w:br/>
         <w:t>);</w:t>
+      </w:r>
+    </w:p>
+    <w:p>
+      <w:pPr>
+        <w:pStyle w:val="Heading2"/>
+      </w:pPr>
+      <w:r>
+        <w:t xml:space="preserve">4.2 Políticas de Governança (PPP1, PBR1, MAD1)</w:t>
+      </w:r>
+    </w:p>
+    <w:p>
+      <w:r>
+        <w:rPr/>
+        <w:t xml:space="preserve">PPP1 - Política de Preservação de Privacidade: Foram criados 4 perfis de acesso (dba_ic, sistema_ic, analise_ic, pg_dbbackup) com permissões GRANT/REVOKE específicas. O perfil sistema_ic tem acesso DML apenas em tabelas negociais, sem acesso às tabelas de auditoria. O perfil analise_ic tem acesso SELECT em tabelas e views, sem acesso a tabelas de auditoria. O perfil pg_dbbackup tem permissões de leitura para execução de backups.</w:t>
+      </w:r>
+    </w:p>
+    <w:p>
+      <w:r>
+        <w:rPr/>
+        <w:t xml:space="preserve">Auditoria (MAD1): Tabelas TA_TB_ATIVIDADE e TA_RL_INSCRICAO_HISTORICO registram todas as operações I/U/D com TP_OPERACAO, DH_OPERACAO (timestamp), NM_USUARIO_BD, NM_USUARIO_APLICACAO e NM_TERMINAL. Funções FC_AUDIT_TB_ATIVIDADE() e FC_AUDIT_INSCR_HIST() capturam os dados via triggers TG_A_IUD_. As tabelas de auditoria contêm todas as colunas das tabelas originais, conforme MAD1 §7.</w:t>
+      </w:r>
+    </w:p>
+    <w:p>
+      <w:r>
+        <w:rPr/>
+        <w:t xml:space="preserve">PBR1 - Política de Backup e Recuperação: Implementada com a tabela TL_LOG_BACKUP para registro de operações, função SP_EXECUTAR_BACKUP_FULL() para execução de backup full, SP_REGISTRAR_BACKUP() para registro de conclusão, e SP_TESTAR_INTEGRIDADE_BACKUP() para verificação de integridade dos backups.</w:t>
+      </w:r>
+    </w:p>
+    <w:p>
+      <w:r>
+        <w:rPr/>
+        <w:t xml:space="preserve">Views (VW_): Foram criadas 4 views para simplificar consultas e restringir acesso: VW_IMPACTO_PROJETO (resumo de impacto por projeto), VW_PARTICIPANTE_ATIVO (participantes com presença), VW_PARCEIRO_APORTE (parceiros e patrocínios), VW_CERTIFICADO_EMITIDO (certificados emitidos). Acesso SELECT concedido ao perfil analise_ic.</w:t>
+      </w:r>
+    </w:p>
+    <w:p>
+      <w:r>
+        <w:rPr/>
+        <w:t xml:space="preserve">Sequences (SQ_): As sequences implícitas do SERIAL foram renomeadas para seguir o padrão SQ_ (ex: SQ_TB_INSTRUTOR, SQ_RL_INSCRICAO_HIST), garantindo conformidade com a nomenclatura MAD1.</w:t>
       </w:r>
     </w:p>
     <w:p>

</xml_diff>